<commit_message>
docs(reports): alinear los informes académicos con el sistema de diseño V2
- Informe_Colores_Tipografia: regenerado por completo sobre la identidad V2
  (#276EF1 índigo, ink #112530, mineral #87D7C6, sunrise #FFB36B, tema
  claro único, Instrument Sans + Manrope). Escalas primitivas, paleta
  semántica, escala tipográfica y mapeo a componentes tomados de
  vectra.css. Se añade la sección 10 con la nota de migración V1 -> V2 y
  se elimina la paleta de modo oscuro.
- Informe_UI_UX_Research: tipografías V2, mapa Leaflet/OpenStreetMap y
  "tarjeta expandible" en vez de "Side Drawer".
- Informe_UX_Brief y Informe_User_Flows: mismas correcciones de texto y
  el azul de acento de los diagramas pasa a #276EF1.
- README de la carpeta: tabla de estado de alineación por informe.
- .gitattributes: .docx/.png/.jpeg marcados como binarios.

Pendiente (Prioridad 4): los diagramas de flujo del Informe_User_Flows y
el flujo "consultar cita por ticket" siguen describiendo la V1.
</commit_message>
<xml_diff>
--- a/docs/reports/Informe_UI_UX_Research_Vectra_Cure.docx
+++ b/docs/reports/Informe_UI_UX_Research_Vectra_Cure.docx
@@ -1679,7 +1679,7 @@
                 <w:color w:val="000000"/>
                 <w:sz w:val="24"/>
               </w:rPr>
-              <w:t>Pantalla dividida: directorio + Google Maps.</w:t>
+              <w:t>Pantalla dividida: directorio + mapa Leaflet/OpenStreetMap.</w:t>
             </w:r>
           </w:p>
         </w:tc>
@@ -2176,7 +2176,7 @@
                 <w:color w:val="000000"/>
                 <w:sz w:val="24"/>
               </w:rPr>
-              <w:t>Interfaz limpia con Plus Jakarta Sans e Inter; reserva en dos pasos.</w:t>
+              <w:t>Interfaz limpia con Instrument Sans y Manrope; reserva en dos pasos.</w:t>
             </w:r>
           </w:p>
         </w:tc>
@@ -2352,7 +2352,7 @@
                 <w:color w:val="000000"/>
                 <w:sz w:val="24"/>
               </w:rPr>
-              <w:t>Side Drawer con reseñas completas, fotos y tarifas desglosadas.</w:t>
+              <w:t>Tarjeta expandible con reseñas completas, fotos y tarifas desglosadas.</w:t>
             </w:r>
           </w:p>
         </w:tc>
@@ -3557,7 +3557,7 @@
                 <w:color w:val="000000"/>
                 <w:sz w:val="24"/>
               </w:rPr>
-              <w:t>Side Drawer que se abre al seleccionar y se cierra sin perder el contexto.</w:t>
+              <w:t>Tarjeta que se expande al seleccionar y se colapsa sin perder el contexto.</w:t>
             </w:r>
           </w:p>
         </w:tc>
@@ -3601,7 +3601,7 @@
                 <w:color w:val="000000"/>
                 <w:sz w:val="24"/>
               </w:rPr>
-              <w:t>Navbar, buscador tipo Google Maps y patrones web reconocibles.</w:t>
+              <w:t>Navbar, buscador tipo mapa y patrones web reconocibles.</w:t>
             </w:r>
           </w:p>
         </w:tc>
@@ -3909,7 +3909,7 @@
           <w:color w:val="000000"/>
           <w:sz w:val="24"/>
         </w:rPr>
-        <w:t>La investigación valida el problema central de Vectra Cure: las personas necesitan elegir atención médica con mayor rapidez y menos incertidumbre. La combinación de calificaciones, credenciales verificadas, cercanía, precio visible y reserva en línea responde directamente a los hallazgos de la muestra. Estos resultados fundamentan una interfaz orientada a la confianza y permiten priorizar el mapa, la tarjeta médica, el Side Drawer y el modal de agendamiento como piezas clave del prototipo.</w:t>
+        <w:t>La investigación valida el problema central de Vectra Cure: las personas necesitan elegir atención médica con mayor rapidez y menos incertidumbre. La combinación de calificaciones, credenciales verificadas, cercanía, precio visible y reserva en línea responde directamente a los hallazgos de la muestra. Estos resultados fundamentan una interfaz orientada a la confianza y permiten priorizar el mapa, la tarjeta médica expandible y el modal de agendamiento como piezas clave del prototipo.</w:t>
       </w:r>
     </w:p>
     <w:sectPr>

</xml_diff>